<commit_message>
fix: address Devin Review findings on PR#133
1. Exclusion masks (ga, sbp, iufd, vt, triplet) now OR-ed into all_exclude
2. Fisher exact test threshold uses expected cell counts, not observed
3. Manuscript parenthetical formula corrected (n_total, not redundant)
4. label_map moved to module scope (available for both forest plots)

Co-Authored-By: Tatsuki Onishi <bougtoir@gmail.com>
</commit_message>
<xml_diff>
--- a/yago_ionv/manuscript_methods_results.docx
+++ b/yago_ionv/manuscript_methods_results.docx
@@ -170,7 +170,7 @@
         <w:rPr>
           <w:sz w:val="20"/>
         </w:rPr>
-        <w:t>A total of 3,479 women who underwent cesarean section during the study period were identified (3,113 singleton and 366 twin pregnancies). After applying exclusion criteria, 3,243 patients remained (3,243 total; 6 excluded for general anesthesia, 13 for intrauterine fetal death, 3 for vanishing twin, 5 for triplet pregnancy, 4 for pre-anesthesia hypotension, and 61 for unavailable anesthesia data). An additional 55 patients who received pre-anesthesia antiemetics were excluded from the outcome analysis, yielding a final analysis cohort of 3,188 patients (2,846 singleton, 342 twin) (Fig. 1).</w:t>
+        <w:t>A total of 3,479 women who underwent cesarean section during the study period were identified (3,113 singleton and 366 twin pregnancies). After applying exclusion criteria, 3,243 patients remained (3,479 total; 6 excluded for general anesthesia, 13 for intrauterine fetal death, 3 for vanishing twin, 5 for triplet pregnancy, 4 for pre-anesthesia hypotension, and 58 for unavailable anesthesia data). An additional 55 patients who received pre-anesthesia antiemetics were excluded from the outcome analysis, yielding a final analysis cohort of 3,188 patients (2,846 singleton, 342 twin) (Fig. 1).</w:t>
       </w:r>
     </w:p>
     <w:p>
@@ -1844,7 +1844,7 @@
               <w:rPr>
                 <w:sz w:val="18"/>
               </w:rPr>
-              <w:t>0.041</w:t>
+              <w:t>0.075</w:t>
             </w:r>
           </w:p>
         </w:tc>

</xml_diff>